<commit_message>
se agregan caja negra de anuncios y noticias
</commit_message>
<xml_diff>
--- a/EduMultiPro 6 Parte/1) Caja Negra EduMultiPro/Documentos en Word/7) Caja Negra CRUD Horario.docx
+++ b/EduMultiPro 6 Parte/1) Caja Negra EduMultiPro/Documentos en Word/7) Caja Negra CRUD Horario.docx
@@ -1232,41 +1232,25 @@
                 <w:sz w:val="22"/>
                 <w:szCs w:val="22"/>
               </w:rPr>
-              <w:t>-</w:t>
-            </w:r>
-            <w:r>
+              <w:t>-Si falta alguno de los campos obligatorios o se seleccionan ambos destinos (profesor y curso), el sistema mostrará un mensaje de error.</w:t>
+            </w:r>
+          </w:p>
+          <w:p>
+            <w:pPr>
+              <w:pStyle w:val="NormalWeb"/>
               <w:rPr>
                 <w:rFonts w:ascii="Arial" w:hAnsi="Arial" w:cs="Arial"/>
                 <w:sz w:val="22"/>
                 <w:szCs w:val="22"/>
               </w:rPr>
-              <w:t>Si falta alguno de los campos obligatorios o se seleccionan ambos destinos (profesor y curso), el sistema mostrará un mensaje de error.</w:t>
-            </w:r>
-          </w:p>
-          <w:p>
-            <w:pPr>
-              <w:pStyle w:val="NormalWeb"/>
+            </w:pPr>
+            <w:r>
               <w:rPr>
                 <w:rFonts w:ascii="Arial" w:hAnsi="Arial" w:cs="Arial"/>
                 <w:sz w:val="22"/>
                 <w:szCs w:val="22"/>
               </w:rPr>
-            </w:pPr>
-            <w:r>
-              <w:rPr>
-                <w:rFonts w:ascii="Arial" w:hAnsi="Arial" w:cs="Arial"/>
-                <w:sz w:val="22"/>
-                <w:szCs w:val="22"/>
-              </w:rPr>
-              <w:t>-</w:t>
-            </w:r>
-            <w:r>
-              <w:rPr>
-                <w:rFonts w:ascii="Arial" w:hAnsi="Arial" w:cs="Arial"/>
-                <w:sz w:val="22"/>
-                <w:szCs w:val="22"/>
-              </w:rPr>
-              <w:t>Si se diligencian correctamente los campos y se selecciona solo uno de los destinos, el horario se guardará correctamente en el sistema.</w:t>
+              <w:t>-Si se diligencian correctamente los campos y se selecciona solo uno de los destinos, el horario se guardará correctamente en el sistema.</w:t>
             </w:r>
           </w:p>
         </w:tc>
@@ -3968,7 +3952,27 @@
                 <w:lang w:eastAsia="en-US"/>
                 <w14:ligatures w14:val="standardContextual"/>
               </w:rPr>
-              <w:t xml:space="preserve"> y Coordinador</w:t>
+              <w:t>,</w:t>
+            </w:r>
+            <w:r>
+              <w:rPr>
+                <w:rFonts w:ascii="Arial" w:hAnsi="Arial" w:cs="Arial"/>
+                <w:color w:val="000000"/>
+                <w:kern w:val="2"/>
+                <w:lang w:eastAsia="en-US"/>
+                <w14:ligatures w14:val="standardContextual"/>
+              </w:rPr>
+              <w:t xml:space="preserve"> Coordinador</w:t>
+            </w:r>
+            <w:r>
+              <w:rPr>
+                <w:rFonts w:ascii="Arial" w:hAnsi="Arial" w:cs="Arial"/>
+                <w:color w:val="000000"/>
+                <w:kern w:val="2"/>
+                <w:lang w:eastAsia="en-US"/>
+                <w14:ligatures w14:val="standardContextual"/>
+              </w:rPr>
+              <w:t>, Profesor y Alumno</w:t>
             </w:r>
           </w:p>
           <w:p>
@@ -4048,8 +4052,7 @@
             <w:pPr>
               <w:spacing w:line="240" w:lineRule="auto"/>
               <w:rPr>
-                <w:rFonts w:ascii="Arial" w:eastAsia="Times New Roman" w:hAnsi="Arial" w:cs="Arial"/>
-                <w:color w:val="000000"/>
+                <w:rFonts w:ascii="Arial" w:hAnsi="Arial" w:cs="Arial"/>
                 <w:kern w:val="2"/>
                 <w:lang w:eastAsia="en-US"/>
                 <w14:ligatures w14:val="standardContextual"/>
@@ -4162,6 +4165,26 @@
                 <w14:ligatures w14:val="standardContextual"/>
               </w:rPr>
               <w:t>.</w:t>
+            </w:r>
+          </w:p>
+          <w:p>
+            <w:pPr>
+              <w:spacing w:line="240" w:lineRule="auto"/>
+              <w:rPr>
+                <w:rFonts w:ascii="Times New Roman" w:eastAsia="Times New Roman" w:hAnsi="Times New Roman" w:cs="Times New Roman"/>
+                <w:color w:val="000000"/>
+                <w:sz w:val="24"/>
+                <w:szCs w:val="24"/>
+              </w:rPr>
+            </w:pPr>
+            <w:r>
+              <w:rPr>
+                <w:rFonts w:ascii="Times New Roman" w:eastAsia="Times New Roman" w:hAnsi="Times New Roman" w:cs="Times New Roman"/>
+                <w:color w:val="000000"/>
+                <w:sz w:val="24"/>
+                <w:szCs w:val="24"/>
+              </w:rPr>
+              <w:t xml:space="preserve">El profesor y alumno podrán ver su horario desde sus interfaces correspondientes. </w:t>
             </w:r>
           </w:p>
         </w:tc>
@@ -4909,7 +4932,7 @@
             <w:pPr>
               <w:spacing w:line="240" w:lineRule="auto"/>
               <w:rPr>
-                <w:rFonts w:ascii="Arial" w:eastAsia="Times New Roman" w:hAnsi="Arial" w:cs="Arial"/>
+                <w:rFonts w:ascii="Arial" w:hAnsi="Arial" w:cs="Arial"/>
                 <w:color w:val="000000"/>
                 <w:kern w:val="2"/>
                 <w:lang w:eastAsia="en-US"/>
@@ -5155,11 +5178,32 @@
                 <w14:ligatures w14:val="standardContextual"/>
               </w:rPr>
               <w:t xml:space="preserve">. </w:t>
+            </w:r>
+          </w:p>
+          <w:p>
+            <w:pPr>
+              <w:spacing w:line="240" w:lineRule="auto"/>
+              <w:rPr>
+                <w:rFonts w:ascii="Times New Roman" w:eastAsia="Times New Roman" w:hAnsi="Times New Roman" w:cs="Times New Roman"/>
+                <w:color w:val="000000"/>
+                <w:sz w:val="24"/>
+                <w:szCs w:val="24"/>
+              </w:rPr>
+            </w:pPr>
+            <w:r>
+              <w:rPr>
+                <w:rFonts w:ascii="Times New Roman" w:eastAsia="Times New Roman" w:hAnsi="Times New Roman" w:cs="Times New Roman"/>
+                <w:color w:val="000000"/>
+                <w:sz w:val="24"/>
+                <w:szCs w:val="24"/>
+              </w:rPr>
+              <w:t xml:space="preserve">El profesor y alumno podrán ver su horario desde sus interfaces correspondientes. </w:t>
             </w:r>
           </w:p>
         </w:tc>
       </w:tr>
     </w:tbl>
+    <w:p/>
     <w:p>
       <w:pPr>
         <w:spacing w:line="240" w:lineRule="auto"/>
@@ -5170,48 +5214,14 @@
           <w:szCs w:val="24"/>
         </w:rPr>
       </w:pPr>
-    </w:p>
-    <w:p>
-      <w:pPr>
-        <w:spacing w:line="240" w:lineRule="auto"/>
+      <w:r>
         <w:rPr>
           <w:rFonts w:ascii="Times New Roman" w:eastAsia="Times New Roman" w:hAnsi="Times New Roman" w:cs="Times New Roman"/>
           <w:color w:val="000000"/>
           <w:sz w:val="24"/>
           <w:szCs w:val="24"/>
         </w:rPr>
-      </w:pPr>
-    </w:p>
-    <w:p>
-      <w:pPr>
-        <w:spacing w:line="240" w:lineRule="auto"/>
-        <w:rPr>
-          <w:rFonts w:ascii="Times New Roman" w:eastAsia="Times New Roman" w:hAnsi="Times New Roman" w:cs="Times New Roman"/>
-          <w:color w:val="000000"/>
-          <w:sz w:val="24"/>
-          <w:szCs w:val="24"/>
-        </w:rPr>
-      </w:pPr>
-    </w:p>
-    <w:p/>
-    <w:p/>
-    <w:p>
-      <w:pPr>
-        <w:spacing w:line="240" w:lineRule="auto"/>
-        <w:rPr>
-          <w:rFonts w:ascii="Times New Roman" w:eastAsia="Times New Roman" w:hAnsi="Times New Roman" w:cs="Times New Roman"/>
-          <w:color w:val="000000"/>
-          <w:sz w:val="24"/>
-          <w:szCs w:val="24"/>
-        </w:rPr>
-      </w:pPr>
-      <w:r>
-        <w:rPr>
-          <w:rFonts w:ascii="Times New Roman" w:eastAsia="Times New Roman" w:hAnsi="Times New Roman" w:cs="Times New Roman"/>
-          <w:color w:val="000000"/>
-          <w:sz w:val="24"/>
-          <w:szCs w:val="24"/>
-        </w:rPr>
+        <w:lastRenderedPageBreak/>
         <w:t>Tabla en la que el administrador puede ver l</w:t>
       </w:r>
       <w:r>
@@ -5531,6 +5541,28 @@
           <w:szCs w:val="24"/>
         </w:rPr>
       </w:pPr>
+    </w:p>
+    <w:p>
+      <w:pPr>
+        <w:spacing w:line="240" w:lineRule="auto"/>
+        <w:rPr>
+          <w:rFonts w:ascii="Times New Roman" w:eastAsia="Times New Roman" w:hAnsi="Times New Roman" w:cs="Times New Roman"/>
+          <w:color w:val="000000"/>
+          <w:sz w:val="24"/>
+          <w:szCs w:val="24"/>
+        </w:rPr>
+      </w:pPr>
+    </w:p>
+    <w:p>
+      <w:pPr>
+        <w:spacing w:line="240" w:lineRule="auto"/>
+        <w:rPr>
+          <w:rFonts w:ascii="Times New Roman" w:eastAsia="Times New Roman" w:hAnsi="Times New Roman" w:cs="Times New Roman"/>
+          <w:color w:val="000000"/>
+          <w:sz w:val="24"/>
+          <w:szCs w:val="24"/>
+        </w:rPr>
+      </w:pPr>
       <w:r>
         <w:rPr>
           <w:rFonts w:ascii="Times New Roman" w:eastAsia="Times New Roman" w:hAnsi="Times New Roman" w:cs="Times New Roman"/>
@@ -5631,16 +5663,120 @@
           <w:sz w:val="24"/>
           <w:szCs w:val="24"/>
         </w:rPr>
-        <w:t>Se puede ver la evidencia de l</w:t>
-      </w:r>
-      <w:r>
+        <w:t xml:space="preserve">El profesor y alumno podrán ver su horario desde sus interfaces correspondientes. </w:t>
+      </w:r>
+    </w:p>
+    <w:p>
+      <w:pPr>
+        <w:spacing w:line="240" w:lineRule="auto"/>
         <w:rPr>
           <w:rFonts w:ascii="Times New Roman" w:eastAsia="Times New Roman" w:hAnsi="Times New Roman" w:cs="Times New Roman"/>
           <w:color w:val="000000"/>
           <w:sz w:val="24"/>
           <w:szCs w:val="24"/>
         </w:rPr>
-        <w:t>as jornadas</w:t>
+      </w:pPr>
+      <w:r>
+        <w:rPr>
+          <w:rFonts w:ascii="Times New Roman" w:eastAsia="Times New Roman" w:hAnsi="Times New Roman" w:cs="Times New Roman"/>
+          <w:noProof/>
+          <w:color w:val="000000"/>
+          <w:sz w:val="24"/>
+          <w:szCs w:val="24"/>
+        </w:rPr>
+        <w:drawing>
+          <wp:inline distT="0" distB="0" distL="0" distR="0" wp14:anchorId="6E5BBEC7" wp14:editId="26C5CBC5">
+            <wp:extent cx="5612130" cy="3150235"/>
+            <wp:effectExtent l="0" t="0" r="7620" b="0"/>
+            <wp:docPr id="11" name="Imagen 11"/>
+            <wp:cNvGraphicFramePr>
+              <a:graphicFrameLocks xmlns:a="http://schemas.openxmlformats.org/drawingml/2006/main" noChangeAspect="1"/>
+            </wp:cNvGraphicFramePr>
+            <a:graphic xmlns:a="http://schemas.openxmlformats.org/drawingml/2006/main">
+              <a:graphicData uri="http://schemas.openxmlformats.org/drawingml/2006/picture">
+                <pic:pic xmlns:pic="http://schemas.openxmlformats.org/drawingml/2006/picture">
+                  <pic:nvPicPr>
+                    <pic:cNvPr id="11" name="Imagen 11"/>
+                    <pic:cNvPicPr/>
+                  </pic:nvPicPr>
+                  <pic:blipFill>
+                    <a:blip r:embed="rId20" cstate="print">
+                      <a:extLst>
+                        <a:ext uri="{28A0092B-C50C-407E-A947-70E740481C1C}">
+                          <a14:useLocalDpi xmlns:a14="http://schemas.microsoft.com/office/drawing/2010/main" val="0"/>
+                        </a:ext>
+                      </a:extLst>
+                    </a:blip>
+                    <a:stretch>
+                      <a:fillRect/>
+                    </a:stretch>
+                  </pic:blipFill>
+                  <pic:spPr>
+                    <a:xfrm>
+                      <a:off x="0" y="0"/>
+                      <a:ext cx="5612130" cy="3150235"/>
+                    </a:xfrm>
+                    <a:prstGeom prst="rect">
+                      <a:avLst/>
+                    </a:prstGeom>
+                  </pic:spPr>
+                </pic:pic>
+              </a:graphicData>
+            </a:graphic>
+          </wp:inline>
+        </w:drawing>
+      </w:r>
+    </w:p>
+    <w:p>
+      <w:pPr>
+        <w:spacing w:line="240" w:lineRule="auto"/>
+        <w:rPr>
+          <w:rFonts w:ascii="Times New Roman" w:eastAsia="Times New Roman" w:hAnsi="Times New Roman" w:cs="Times New Roman"/>
+          <w:color w:val="000000"/>
+          <w:sz w:val="24"/>
+          <w:szCs w:val="24"/>
+        </w:rPr>
+      </w:pPr>
+    </w:p>
+    <w:p>
+      <w:pPr>
+        <w:spacing w:line="240" w:lineRule="auto"/>
+        <w:rPr>
+          <w:rFonts w:ascii="Times New Roman" w:eastAsia="Times New Roman" w:hAnsi="Times New Roman" w:cs="Times New Roman"/>
+          <w:color w:val="000000"/>
+          <w:sz w:val="24"/>
+          <w:szCs w:val="24"/>
+        </w:rPr>
+      </w:pPr>
+    </w:p>
+    <w:p>
+      <w:pPr>
+        <w:spacing w:line="240" w:lineRule="auto"/>
+        <w:rPr>
+          <w:rFonts w:ascii="Times New Roman" w:eastAsia="Times New Roman" w:hAnsi="Times New Roman" w:cs="Times New Roman"/>
+          <w:color w:val="000000"/>
+          <w:sz w:val="24"/>
+          <w:szCs w:val="24"/>
+        </w:rPr>
+      </w:pPr>
+      <w:r>
+        <w:rPr>
+          <w:rFonts w:ascii="Times New Roman" w:eastAsia="Times New Roman" w:hAnsi="Times New Roman" w:cs="Times New Roman"/>
+          <w:color w:val="000000"/>
+          <w:sz w:val="24"/>
+          <w:szCs w:val="24"/>
+        </w:rPr>
+        <w:lastRenderedPageBreak/>
+        <w:t>Se puede ver la evidencia de l</w:t>
+      </w:r>
+      <w:r>
+        <w:rPr>
+          <w:rFonts w:ascii="Times New Roman" w:eastAsia="Times New Roman" w:hAnsi="Times New Roman" w:cs="Times New Roman"/>
+          <w:color w:val="000000"/>
+          <w:sz w:val="24"/>
+          <w:szCs w:val="24"/>
+        </w:rPr>
+        <w:t>os horarios</w:t>
       </w:r>
       <w:r>
         <w:rPr>

</xml_diff>